<commit_message>
Actualizacion del diagrama relacional, documentos de sugerenciade trigger, procedimientos y funciones, dic de datos y backup: Modulo8. Integracion vistas modulo3 y actulizacion dic datos modulo1 y auditoria
</commit_message>
<xml_diff>
--- a/Modulo5/SugerenciaTriggeryProcedimeintos.docx
+++ b/Modulo5/SugerenciaTriggeryProcedimeintos.docx
@@ -239,7 +239,7 @@
         <w:rPr>
           <w:rFonts w:cs="Times New Roman"/>
         </w:rPr>
-        <w:t>7</w:t>
+        <w:t>8</w:t>
       </w:r>
       <w:r>
         <w:rPr>
@@ -2696,512 +2696,6 @@
       <w:proofErr w:type="spellEnd"/>
     </w:p>
     <w:p/>
-    <w:p>
-      <w:pPr>
-        <w:pStyle w:val="Ttulo3"/>
-      </w:pPr>
-      <w:bookmarkStart w:id="1" w:name="_Toc229056116"/>
-      <w:proofErr w:type="spellStart"/>
-      <w:r>
-        <w:t>fn_obtener_modelo_activo_por_especie</w:t>
-      </w:r>
-      <w:bookmarkEnd w:id="1"/>
-      <w:proofErr w:type="spellEnd"/>
-    </w:p>
-    <w:p>
-      <w:r>
-        <w:t>Recibe el tipo de especie del activo biológico (pequeña, mediana, grande) y retorna la versión del modelo actualmente en producción que corresponde a esa escala. Consulta `</w:t>
-      </w:r>
-      <w:proofErr w:type="spellStart"/>
-      <w:r>
-        <w:t>versiones_modelos</w:t>
-      </w:r>
-      <w:proofErr w:type="spellEnd"/>
-      <w:r>
-        <w:t>` filtrando por `</w:t>
-      </w:r>
-      <w:proofErr w:type="spellStart"/>
-      <w:r>
-        <w:t>esta_produccion</w:t>
-      </w:r>
-      <w:proofErr w:type="spellEnd"/>
-      <w:r>
-        <w:t xml:space="preserve"> = true` y el tipo de algoritmo asociado a la especie. Usada por el motor de inferencia (RF-66) antes de ejecutar cada predicción.</w:t>
-      </w:r>
-    </w:p>
-    <w:p/>
-    <w:p>
-      <w:bookmarkStart w:id="2" w:name="_Toc229056117"/>
-      <w:proofErr w:type="spellStart"/>
-      <w:r>
-        <w:rPr>
-          <w:rStyle w:val="Ttulo3Car"/>
-        </w:rPr>
-        <w:t>fn_calcular_probabilidad_contagio</w:t>
-      </w:r>
-      <w:bookmarkEnd w:id="2"/>
-      <w:proofErr w:type="spellEnd"/>
-    </w:p>
-    <w:p>
-      <w:r>
-        <w:t xml:space="preserve">Implementa la fórmula </w:t>
-      </w:r>
-      <w:proofErr w:type="spellStart"/>
-      <w:r>
-        <w:t>P_contagio</w:t>
-      </w:r>
-      <w:proofErr w:type="spellEnd"/>
-      <w:r>
-        <w:t xml:space="preserve"> = W_fs×Fs + </w:t>
-      </w:r>
-      <w:proofErr w:type="spellStart"/>
-      <w:r>
-        <w:t>W_fa×Fa</w:t>
-      </w:r>
-      <w:proofErr w:type="spellEnd"/>
-      <w:r>
-        <w:t xml:space="preserve"> + </w:t>
-      </w:r>
-      <w:proofErr w:type="spellStart"/>
-      <w:r>
-        <w:t>W_fd×Fd</w:t>
-      </w:r>
-      <w:proofErr w:type="spellEnd"/>
-      <w:r>
-        <w:t xml:space="preserve"> del RF-68. Recibe los </w:t>
-      </w:r>
-      <w:proofErr w:type="gramStart"/>
-      <w:r>
-        <w:t>factores sanitario</w:t>
-      </w:r>
-      <w:proofErr w:type="gramEnd"/>
-      <w:r>
-        <w:t>, ambiental y de densidad junto con sus pesos configurados desde M09, y retorna la probabilidad de contagio como numérico. Los pesos tienen valores por defecto auditables y son configurables. Usada internamente al generar predicciones de tipo contagio.</w:t>
-      </w:r>
-    </w:p>
-    <w:p/>
-    <w:p>
-      <w:pPr>
-        <w:pStyle w:val="Ttulo3"/>
-      </w:pPr>
-      <w:bookmarkStart w:id="3" w:name="_Toc229056118"/>
-      <w:proofErr w:type="spellStart"/>
-      <w:r>
-        <w:t>fn_supera_umbral_clasificacion</w:t>
-      </w:r>
-      <w:bookmarkEnd w:id="3"/>
-      <w:proofErr w:type="spellEnd"/>
-    </w:p>
-    <w:p>
-      <w:r>
-        <w:t>Recibe una probabilidad y el umbral configurado en la versión del modelo activa (referencia: 70%). Retorna un booleano indicando si la predicción debe marcarse como riesgo alto. Centraliza la lógica del umbral para que todos los flujos (inferencia, alertas, validación) usen la misma regla sin duplicar código.</w:t>
-      </w:r>
-    </w:p>
-    <w:p/>
-    <w:p>
-      <w:pPr>
-        <w:pStyle w:val="Ttulo3"/>
-      </w:pPr>
-      <w:bookmarkStart w:id="4" w:name="_Toc229056119"/>
-      <w:proofErr w:type="spellStart"/>
-      <w:r>
-        <w:t>fn_validar_metricas_modelo</w:t>
-      </w:r>
-      <w:bookmarkEnd w:id="4"/>
-      <w:proofErr w:type="spellEnd"/>
-    </w:p>
-    <w:p>
-      <w:r>
-        <w:t xml:space="preserve">Recibe los valores de F1-score y </w:t>
-      </w:r>
-      <w:proofErr w:type="spellStart"/>
-      <w:r>
-        <w:t>Recall</w:t>
-      </w:r>
-      <w:proofErr w:type="spellEnd"/>
-      <w:r>
-        <w:t xml:space="preserve"> de clase riesgo alto calculados durante un ciclo de entrenamiento, y valida si cumplen los mínimos requeridos (F1 ≥ 0.80, </w:t>
-      </w:r>
-      <w:proofErr w:type="spellStart"/>
-      <w:r>
-        <w:t>Recall</w:t>
-      </w:r>
-      <w:proofErr w:type="spellEnd"/>
-      <w:r>
-        <w:t xml:space="preserve"> ≥ 0.85 según RF-69). Retorna un resultado con el estado resultante: APROBADO o RECHAZADO, más el campo que no cumplió en caso de rechazo. Usada por el proceso de validación automática de `</w:t>
-      </w:r>
-      <w:proofErr w:type="spellStart"/>
-      <w:r>
-        <w:t>versiones_modelos</w:t>
-      </w:r>
-      <w:proofErr w:type="spellEnd"/>
-      <w:r>
-        <w:t>`.</w:t>
-      </w:r>
-    </w:p>
-    <w:p/>
-    <w:p>
-      <w:pPr>
-        <w:pStyle w:val="Ttulo3"/>
-      </w:pPr>
-      <w:bookmarkStart w:id="5" w:name="_Toc229056120"/>
-      <w:proofErr w:type="spellStart"/>
-      <w:r>
-        <w:t>fn_calcular_drift_score</w:t>
-      </w:r>
-      <w:bookmarkEnd w:id="5"/>
-      <w:proofErr w:type="spellEnd"/>
-    </w:p>
-    <w:p>
-      <w:r>
-        <w:t>Recibe el `</w:t>
-      </w:r>
-      <w:proofErr w:type="spellStart"/>
-      <w:r>
-        <w:t>id_version_modelo</w:t>
-      </w:r>
-      <w:proofErr w:type="spellEnd"/>
-      <w:r>
-        <w:t>` y el período de referencia. Consulta `</w:t>
-      </w:r>
-      <w:proofErr w:type="spellStart"/>
-      <w:r>
-        <w:t>metricas_drift</w:t>
-      </w:r>
-      <w:proofErr w:type="spellEnd"/>
-      <w:r>
-        <w:t>` para ese modelo y calcula si alguna métrica supera el `</w:t>
-      </w:r>
-      <w:proofErr w:type="spellStart"/>
-      <w:r>
-        <w:t>umbral_alerta_drift</w:t>
-      </w:r>
-      <w:proofErr w:type="spellEnd"/>
-      <w:r>
-        <w:t xml:space="preserve">`. Retorna el </w:t>
-      </w:r>
-      <w:proofErr w:type="spellStart"/>
-      <w:r>
-        <w:t>drift_score</w:t>
-      </w:r>
-      <w:proofErr w:type="spellEnd"/>
-      <w:r>
-        <w:t xml:space="preserve"> agregado. Usada por el proceso de evaluación de degradación que dispara el reentrenamiento automático (RF-71, </w:t>
-      </w:r>
-      <w:proofErr w:type="spellStart"/>
-      <w:r>
-        <w:t>trigger</w:t>
-      </w:r>
-      <w:proofErr w:type="spellEnd"/>
-      <w:r>
-        <w:t xml:space="preserve"> DEGRADACION).</w:t>
-      </w:r>
-    </w:p>
-    <w:p/>
-    <w:p>
-      <w:pPr>
-        <w:pStyle w:val="Ttulo3"/>
-      </w:pPr>
-      <w:bookmarkStart w:id="6" w:name="_Toc229056121"/>
-      <w:proofErr w:type="spellStart"/>
-      <w:r>
-        <w:lastRenderedPageBreak/>
-        <w:t>fn_contar_registros_etiquetados_disponibles</w:t>
-      </w:r>
-      <w:bookmarkEnd w:id="6"/>
-      <w:proofErr w:type="spellEnd"/>
-    </w:p>
-    <w:p>
-      <w:r>
-        <w:t xml:space="preserve">Recibe un rango de fechas y el tipo de modelo. Cuenta cuántos registros con datos clínicos válidos (provenientes de retroalimentación RF-72 o inferencias históricas RF-67) están disponibles para construir un </w:t>
-      </w:r>
-      <w:proofErr w:type="spellStart"/>
-      <w:r>
-        <w:t>dataset</w:t>
-      </w:r>
-      <w:proofErr w:type="spellEnd"/>
-      <w:r>
-        <w:t xml:space="preserve"> de reentrenamiento. Retorna el conteo. Si el resultado es menor a 500, el proceso de reentrenamiento debe abortarse (flujo alterno E1 de RF-71).</w:t>
-      </w:r>
-    </w:p>
-    <w:p/>
-    <w:p>
-      <w:pPr>
-        <w:pStyle w:val="Ttulo3"/>
-      </w:pPr>
-      <w:bookmarkStart w:id="7" w:name="_Toc229056122"/>
-      <w:r>
-        <w:t>fn_dataset_hash_sha256</w:t>
-      </w:r>
-      <w:bookmarkEnd w:id="7"/>
-    </w:p>
-    <w:p>
-      <w:r>
-        <w:t>Recibe el `</w:t>
-      </w:r>
-      <w:proofErr w:type="spellStart"/>
-      <w:r>
-        <w:t>id_dataset</w:t>
-      </w:r>
-      <w:proofErr w:type="spellEnd"/>
-      <w:r>
-        <w:t xml:space="preserve">` y calcula o recupera el hash SHA-256 del </w:t>
-      </w:r>
-      <w:proofErr w:type="spellStart"/>
-      <w:r>
-        <w:t>dataset</w:t>
-      </w:r>
-      <w:proofErr w:type="spellEnd"/>
-      <w:r>
-        <w:t xml:space="preserve"> asociado. Se utiliza para verificar integridad del </w:t>
-      </w:r>
-      <w:proofErr w:type="spellStart"/>
-      <w:r>
-        <w:t>dataset</w:t>
-      </w:r>
-      <w:proofErr w:type="spellEnd"/>
-      <w:r>
-        <w:t xml:space="preserve"> antes de iniciar entrenamiento y al registrar la nueva versión del modelo en RF-69. Retorna el hash como cadena de 64 caracteres.</w:t>
-      </w:r>
-    </w:p>
-    <w:p/>
-    <w:p>
-      <w:pPr>
-        <w:pStyle w:val="Ttulo3"/>
-      </w:pPr>
-      <w:bookmarkStart w:id="8" w:name="_Toc229056123"/>
-      <w:proofErr w:type="spellStart"/>
-      <w:r>
-        <w:t>fn_verificar_integridad_artefacto</w:t>
-      </w:r>
-      <w:bookmarkEnd w:id="8"/>
-      <w:proofErr w:type="spellEnd"/>
-    </w:p>
-    <w:p>
-      <w:r>
-        <w:t>Recibe el `</w:t>
-      </w:r>
-      <w:proofErr w:type="spellStart"/>
-      <w:r>
-        <w:t>id_version_modelo</w:t>
-      </w:r>
-      <w:proofErr w:type="spellEnd"/>
-      <w:r>
-        <w:t>` y el hash calculado del artefacto en el momento del envío. Compara contra `</w:t>
-      </w:r>
-      <w:proofErr w:type="spellStart"/>
-      <w:r>
-        <w:t>hash_artecfacto</w:t>
-      </w:r>
-      <w:proofErr w:type="spellEnd"/>
-      <w:r>
-        <w:t>` registrado en `</w:t>
-      </w:r>
-      <w:proofErr w:type="spellStart"/>
-      <w:r>
-        <w:t>versiones_modelos</w:t>
-      </w:r>
-      <w:proofErr w:type="spellEnd"/>
-      <w:r>
-        <w:t xml:space="preserve">`. Retorna verdadero </w:t>
-      </w:r>
-      <w:proofErr w:type="spellStart"/>
-      <w:r>
-        <w:t>si</w:t>
-      </w:r>
-      <w:proofErr w:type="spellEnd"/>
-      <w:r>
-        <w:t xml:space="preserve"> coinciden o falso si hay discrepancia, lo que fuerza el </w:t>
-      </w:r>
-      <w:proofErr w:type="spellStart"/>
-      <w:r>
-        <w:t>abort</w:t>
-      </w:r>
-      <w:proofErr w:type="spellEnd"/>
-      <w:r>
-        <w:t xml:space="preserve"> del proceso (causa: INTEGRIDAD_COMPROMETIDA).</w:t>
-      </w:r>
-    </w:p>
-    <w:p/>
-    <w:p>
-      <w:pPr>
-        <w:pStyle w:val="Ttulo3"/>
-      </w:pPr>
-      <w:bookmarkStart w:id="9" w:name="_Toc229056124"/>
-      <w:proofErr w:type="spellStart"/>
-      <w:r>
-        <w:t>fn_obtener_historial_predicciones_paginado</w:t>
-      </w:r>
-      <w:bookmarkEnd w:id="9"/>
-      <w:proofErr w:type="spellEnd"/>
-    </w:p>
-    <w:p>
-      <w:r>
-        <w:t xml:space="preserve">Implementa la consulta del historial diagnóstico (RF-67) con paginación por cursor basada en </w:t>
-      </w:r>
-      <w:proofErr w:type="gramStart"/>
-      <w:r>
-        <w:t>`(</w:t>
-      </w:r>
-      <w:proofErr w:type="spellStart"/>
-      <w:proofErr w:type="gramEnd"/>
-      <w:r>
-        <w:t>fecha_prediccion</w:t>
-      </w:r>
-      <w:proofErr w:type="spellEnd"/>
-      <w:r>
-        <w:t xml:space="preserve">, </w:t>
-      </w:r>
-      <w:proofErr w:type="spellStart"/>
-      <w:r>
-        <w:t>id_</w:t>
-      </w:r>
-      <w:proofErr w:type="gramStart"/>
-      <w:r>
-        <w:t>prediccion</w:t>
-      </w:r>
-      <w:proofErr w:type="spellEnd"/>
-      <w:r>
-        <w:t>)`</w:t>
-      </w:r>
-      <w:proofErr w:type="gramEnd"/>
-      <w:r>
-        <w:t>. Recibe el `</w:t>
-      </w:r>
-      <w:proofErr w:type="spellStart"/>
-      <w:r>
-        <w:t>id_activo_biologico</w:t>
-      </w:r>
-      <w:proofErr w:type="spellEnd"/>
-      <w:r>
-        <w:t xml:space="preserve">`, rango de fechas, filtros opcionales de nivel de riesgo y patología, cursor de página y tamaño de página (máximo 50). Retorna el conjunto de predicciones ordenadas por </w:t>
-      </w:r>
-      <w:proofErr w:type="spellStart"/>
-      <w:r>
-        <w:t>timestamp</w:t>
-      </w:r>
-      <w:proofErr w:type="spellEnd"/>
-      <w:r>
-        <w:t xml:space="preserve"> DESC, </w:t>
-      </w:r>
-      <w:proofErr w:type="gramStart"/>
-      <w:r>
-        <w:t>id</w:t>
-      </w:r>
-      <w:proofErr w:type="gramEnd"/>
-      <w:r>
-        <w:t xml:space="preserve"> DESC, junto con el cursor de la siguiente página.</w:t>
-      </w:r>
-    </w:p>
-    <w:p/>
-    <w:p>
-      <w:pPr>
-        <w:pStyle w:val="Ttulo3"/>
-      </w:pPr>
-      <w:bookmarkStart w:id="10" w:name="_Toc229056125"/>
-      <w:proofErr w:type="spellStart"/>
-      <w:r>
-        <w:t>fn_verificar_ventana_retroalimentacion</w:t>
-      </w:r>
-      <w:bookmarkEnd w:id="10"/>
-      <w:proofErr w:type="spellEnd"/>
-    </w:p>
-    <w:p>
-      <w:r>
-        <w:t>Recibe el `</w:t>
-      </w:r>
-      <w:proofErr w:type="spellStart"/>
-      <w:r>
-        <w:t>id_prediccion</w:t>
-      </w:r>
-      <w:proofErr w:type="spellEnd"/>
-      <w:r>
-        <w:t>` y la fecha actual. Calcula si el registro de retroalimentación cae dentro de la ventana temporal válida (default 90 días desde la fecha de la predicción, configurable en M09). Retorna verdadero o falso. Si es falso, el proceso de registro debe rechazarse con el flujo alterno E9 de RF-72.</w:t>
-      </w:r>
-    </w:p>
-    <w:p/>
-    <w:p>
-      <w:pPr>
-        <w:pStyle w:val="Ttulo3"/>
-      </w:pPr>
-      <w:bookmarkStart w:id="11" w:name="_Toc229056126"/>
-      <w:proofErr w:type="spellStart"/>
-      <w:r>
-        <w:t>fn_detectar_conflicto_retroalimentacion</w:t>
-      </w:r>
-      <w:bookmarkEnd w:id="11"/>
-      <w:proofErr w:type="spellEnd"/>
-    </w:p>
-    <w:p>
-      <w:r>
-        <w:t>Recibe el `</w:t>
-      </w:r>
-      <w:proofErr w:type="spellStart"/>
-      <w:r>
-        <w:t>id_prediccion</w:t>
-      </w:r>
-      <w:proofErr w:type="spellEnd"/>
-      <w:r>
-        <w:t>`. Consulta los registros existentes de retroalimentación para esa predicción en `</w:t>
-      </w:r>
-      <w:proofErr w:type="spellStart"/>
-      <w:r>
-        <w:t>auditorias_predicciones</w:t>
-      </w:r>
-      <w:proofErr w:type="spellEnd"/>
-      <w:r>
-        <w:t xml:space="preserve">`. Determina si existen evaluaciones contradictorias entre veterinarios distintos (ej. uno marcó CORRECTO y otro INCORRECTO). Retorna un </w:t>
-      </w:r>
-      <w:r>
-        <w:lastRenderedPageBreak/>
-        <w:t>booleano `</w:t>
-      </w:r>
-      <w:proofErr w:type="spellStart"/>
-      <w:r>
-        <w:t>conflicto_detectado</w:t>
-      </w:r>
-      <w:proofErr w:type="spellEnd"/>
-      <w:r>
-        <w:t xml:space="preserve">`. Usada para marcar el </w:t>
-      </w:r>
-      <w:proofErr w:type="spellStart"/>
-      <w:r>
-        <w:t>flag</w:t>
-      </w:r>
-      <w:proofErr w:type="spellEnd"/>
-      <w:r>
-        <w:t xml:space="preserve"> `</w:t>
-      </w:r>
-      <w:proofErr w:type="spellStart"/>
-      <w:r>
-        <w:t>conflicto_retroalimentacion</w:t>
-      </w:r>
-      <w:proofErr w:type="spellEnd"/>
-      <w:r>
-        <w:t xml:space="preserve"> = true` en el evento de auditoría RF-73.</w:t>
-      </w:r>
-    </w:p>
-    <w:p/>
-    <w:p>
-      <w:proofErr w:type="spellStart"/>
-      <w:r>
-        <w:t>fn_prioridad_etiqueta_retroalimentacion</w:t>
-      </w:r>
-      <w:proofErr w:type="spellEnd"/>
-    </w:p>
-    <w:p>
-      <w:r>
-        <w:t xml:space="preserve">Recibe una lista de retroalimentaciones contradictorias para la misma predicción. Aplica las reglas de prioridad definidas en RF-72: primero por severidad clínica (INCORRECTO/PARCIAL sobre CORRECTO), luego por fuente del diagnóstico (LABORATORIO &gt; HISTORIAL_CLINICO &gt; OBSERVACION_DIRECTA &gt; OTRO &gt; </w:t>
-      </w:r>
-      <w:proofErr w:type="spellStart"/>
-      <w:r>
-        <w:t>fuente_desconocida</w:t>
-      </w:r>
-      <w:proofErr w:type="spellEnd"/>
-      <w:r>
-        <w:t>). Retorna el `id` de la retroalimentación con mayor peso para uso en RF-71.</w:t>
-      </w:r>
-    </w:p>
     <w:p/>
     <w:p>
       <w:pPr>
@@ -3210,990 +2704,11 @@
       <w:r>
         <w:t xml:space="preserve"> </w:t>
       </w:r>
-      <w:bookmarkStart w:id="12" w:name="_Toc229056127"/>
+      <w:bookmarkStart w:id="1" w:name="_Toc229056127"/>
       <w:r>
         <w:t>TRIGGERS</w:t>
       </w:r>
-      <w:bookmarkEnd w:id="12"/>
-    </w:p>
-    <w:p>
-      <w:pPr>
-        <w:pStyle w:val="Ttulo3"/>
-      </w:pPr>
-      <w:bookmarkStart w:id="13" w:name="_Toc229056128"/>
-      <w:proofErr w:type="spellStart"/>
-      <w:r>
-        <w:t>trg_after_insert_prediccion</w:t>
-      </w:r>
-      <w:bookmarkEnd w:id="13"/>
-      <w:proofErr w:type="spellEnd"/>
-    </w:p>
-    <w:p>
-      <w:r>
-        <w:t>Se dispara después de cada INSERT en `predicciones`. Llama automáticamente a `</w:t>
-      </w:r>
-      <w:proofErr w:type="spellStart"/>
-      <w:r>
-        <w:t>sp_evaluar_umbral_y_generar_alerta</w:t>
-      </w:r>
-      <w:proofErr w:type="spellEnd"/>
-      <w:r>
-        <w:t xml:space="preserve">` para determinar si la predicción supera el umbral configurado y debe generar una alerta patológica. También invoca `sp_registrar_evento_auditoria_m04` con </w:t>
-      </w:r>
-      <w:proofErr w:type="spellStart"/>
-      <w:r>
-        <w:t>tipo_evento</w:t>
-      </w:r>
-      <w:proofErr w:type="spellEnd"/>
-      <w:r>
-        <w:t xml:space="preserve"> INFERENCIA_EJECUTADA. Garantiza que ninguna predicción quede sin evaluación de umbral.</w:t>
-      </w:r>
-    </w:p>
-    <w:p/>
-    <w:p>
-      <w:pPr>
-        <w:pStyle w:val="Ttulo3"/>
-      </w:pPr>
-      <w:bookmarkStart w:id="14" w:name="_Toc229056129"/>
-      <w:proofErr w:type="spellStart"/>
-      <w:r>
-        <w:t>trg_before_update_predicciones</w:t>
-      </w:r>
-      <w:bookmarkEnd w:id="14"/>
-      <w:proofErr w:type="spellEnd"/>
-    </w:p>
-    <w:p>
-      <w:r>
-        <w:t>Se dispara antes de cualquier UPDATE en `predicciones`. Bloquea la operación y lanza una excepción, ya que las predicciones son inmutables una vez persistidas (requisito de trazabilidad de RF-67). Toda modificación debe pasar por retroalimentación en `</w:t>
-      </w:r>
-      <w:proofErr w:type="spellStart"/>
-      <w:r>
-        <w:t>auditorias_predicciones</w:t>
-      </w:r>
-      <w:proofErr w:type="spellEnd"/>
-      <w:r>
-        <w:t>`, nunca editando el registro original.</w:t>
-      </w:r>
-    </w:p>
-    <w:p/>
-    <w:p>
-      <w:pPr>
-        <w:pStyle w:val="Ttulo3"/>
-      </w:pPr>
-      <w:bookmarkStart w:id="15" w:name="_Toc229056130"/>
-      <w:proofErr w:type="spellStart"/>
-      <w:r>
-        <w:t>trg_after_insert_version_modelo</w:t>
-      </w:r>
-      <w:bookmarkEnd w:id="15"/>
-      <w:proofErr w:type="spellEnd"/>
-    </w:p>
-    <w:p>
-      <w:r>
-        <w:t>Se dispara después de cada INSERT en `</w:t>
-      </w:r>
-      <w:proofErr w:type="spellStart"/>
-      <w:r>
-        <w:t>versiones_modelos</w:t>
-      </w:r>
-      <w:proofErr w:type="spellEnd"/>
-      <w:r>
-        <w:t>`. Registra automáticamente el evento VERSION_REGISTRADA en auditoría. Si el modelo fue marcado directamente como `</w:t>
-      </w:r>
-      <w:proofErr w:type="spellStart"/>
-      <w:r>
-        <w:t>esta_produccion</w:t>
-      </w:r>
-      <w:proofErr w:type="spellEnd"/>
-      <w:r>
-        <w:t xml:space="preserve"> = true` (caso de migración o excepción controlada), valida que no exista otro modelo en producción para el mismo algoritmo y genera la alerta correspondiente.</w:t>
-      </w:r>
-    </w:p>
-    <w:p/>
-    <w:p>
-      <w:pPr>
-        <w:pStyle w:val="Ttulo3"/>
-      </w:pPr>
-      <w:bookmarkStart w:id="16" w:name="_Toc229056131"/>
-      <w:proofErr w:type="spellStart"/>
-      <w:r>
-        <w:lastRenderedPageBreak/>
-        <w:t>trg_before_update_version_modelo_produccion</w:t>
-      </w:r>
-      <w:bookmarkEnd w:id="16"/>
-      <w:proofErr w:type="spellEnd"/>
-    </w:p>
-    <w:p>
-      <w:r>
-        <w:t>Se dispara antes de UPDATE en `</w:t>
-      </w:r>
-      <w:proofErr w:type="spellStart"/>
-      <w:r>
-        <w:t>versiones_modelos</w:t>
-      </w:r>
-      <w:proofErr w:type="spellEnd"/>
-      <w:r>
-        <w:t>` cuando cambia el campo `</w:t>
-      </w:r>
-      <w:proofErr w:type="spellStart"/>
-      <w:r>
-        <w:t>esta_produccion</w:t>
-      </w:r>
-      <w:proofErr w:type="spellEnd"/>
-      <w:r>
-        <w:t>`. Verifica que el usuario que realiza la operación tenga el permiso de aprobación clínica (rol Veterinario o Administrador). Impide activar un modelo que esté en estado RECHAZADO. Al activar uno nuevo, desactiva automáticamente el anterior del mismo tipo.</w:t>
-      </w:r>
-    </w:p>
-    <w:p/>
-    <w:p>
-      <w:pPr>
-        <w:pStyle w:val="Ttulo3"/>
-      </w:pPr>
-      <w:bookmarkStart w:id="17" w:name="_Toc229056132"/>
-      <w:proofErr w:type="spellStart"/>
-      <w:r>
-        <w:t>trg_after_insert_metrica_drift</w:t>
-      </w:r>
-      <w:bookmarkEnd w:id="17"/>
-      <w:proofErr w:type="spellEnd"/>
-    </w:p>
-    <w:p>
-      <w:r>
-        <w:t>Se dispara después de INSERT en `</w:t>
-      </w:r>
-      <w:proofErr w:type="spellStart"/>
-      <w:r>
-        <w:t>metricas_drift</w:t>
-      </w:r>
-      <w:proofErr w:type="spellEnd"/>
-      <w:r>
-        <w:t>`. Evalúa si el campo `</w:t>
-      </w:r>
-      <w:proofErr w:type="spellStart"/>
-      <w:r>
-        <w:t>supera_umbral_drift</w:t>
-      </w:r>
-      <w:proofErr w:type="spellEnd"/>
-      <w:r>
-        <w:t xml:space="preserve"> = true`. De ser así, llama a `sp_registrar_evento_auditoria_m04` con severidad WARNING o CRITICAL según la magnitud de la desviación, y encola una notificación al administrador para revisión del estado del modelo.</w:t>
-      </w:r>
-    </w:p>
-    <w:p/>
-    <w:p>
-      <w:pPr>
-        <w:pStyle w:val="Ttulo3"/>
-      </w:pPr>
-      <w:bookmarkStart w:id="18" w:name="_Toc229056133"/>
-      <w:proofErr w:type="spellStart"/>
-      <w:r>
-        <w:t>trg_after_insert_alerta_patologica</w:t>
-      </w:r>
-      <w:bookmarkEnd w:id="18"/>
-      <w:proofErr w:type="spellEnd"/>
-    </w:p>
-    <w:p>
-      <w:r>
-        <w:t>Se dispara después de INSERT en `</w:t>
-      </w:r>
-      <w:proofErr w:type="spellStart"/>
-      <w:r>
-        <w:t>alertas_patologicas</w:t>
-      </w:r>
-      <w:proofErr w:type="spellEnd"/>
-      <w:r>
-        <w:t>`. Registra el evento ALERTA_PREDICCION_GENERADA en auditoría con la información de la predicción de origen, el activo, la finca y la probabilidad. Garantiza que toda alerta generada quede trazada independientemente del flujo que la creó.</w:t>
-      </w:r>
-    </w:p>
-    <w:p/>
-    <w:p>
-      <w:pPr>
-        <w:pStyle w:val="Ttulo3"/>
-      </w:pPr>
-      <w:bookmarkStart w:id="19" w:name="_Toc229056134"/>
-      <w:proofErr w:type="spellStart"/>
-      <w:r>
-        <w:t>trg_after_insert_ciclo_entrenamiento</w:t>
-      </w:r>
-      <w:bookmarkEnd w:id="19"/>
-      <w:proofErr w:type="spellEnd"/>
-    </w:p>
-    <w:p>
-      <w:r>
-        <w:t>Se dispara después de INSERT en `</w:t>
-      </w:r>
-      <w:proofErr w:type="spellStart"/>
-      <w:r>
-        <w:t>ciclos_entrenamientos</w:t>
-      </w:r>
-      <w:proofErr w:type="spellEnd"/>
-      <w:r>
-        <w:t xml:space="preserve">`. Registra el evento REENTRENAMIENTO_INICIADO en auditoría con el tipo de </w:t>
-      </w:r>
-      <w:proofErr w:type="spellStart"/>
-      <w:r>
-        <w:t>trigger</w:t>
-      </w:r>
-      <w:proofErr w:type="spellEnd"/>
-      <w:r>
-        <w:t>, el tipo de modelo y el usuario responsable si aplica. Al actualizar el `</w:t>
-      </w:r>
-      <w:proofErr w:type="spellStart"/>
-      <w:r>
-        <w:t>estado_ciclo</w:t>
-      </w:r>
-      <w:proofErr w:type="spellEnd"/>
-      <w:r>
-        <w:t xml:space="preserve">` </w:t>
-      </w:r>
-      <w:proofErr w:type="spellStart"/>
-      <w:r>
-        <w:t>a</w:t>
-      </w:r>
-      <w:proofErr w:type="spellEnd"/>
-      <w:r>
-        <w:t xml:space="preserve"> COMPLETADO o FALLIDO, un </w:t>
-      </w:r>
-      <w:proofErr w:type="spellStart"/>
-      <w:r>
-        <w:t>trigger</w:t>
-      </w:r>
-      <w:proofErr w:type="spellEnd"/>
-      <w:r>
-        <w:t xml:space="preserve"> complementario registra REENTRENAMIENTO_COMPLETADO o REENTRENAMIENTO_FALLIDO respectivamente.</w:t>
-      </w:r>
-    </w:p>
-    <w:p/>
-    <w:p>
-      <w:pPr>
-        <w:pStyle w:val="Ttulo3"/>
-      </w:pPr>
-      <w:bookmarkStart w:id="20" w:name="_Toc229056135"/>
-      <w:r>
-        <w:t>trg_before_delete_any_m04</w:t>
-      </w:r>
-      <w:bookmarkEnd w:id="20"/>
-    </w:p>
-    <w:p>
-      <w:r>
-        <w:t xml:space="preserve">Trigger de protección aplicado sobre todas las tablas del esquema `modulo4`. Bloquea cualquier operación DELETE e impide la eliminación de registros. Las tablas del módulo son </w:t>
-      </w:r>
-      <w:proofErr w:type="spellStart"/>
-      <w:r>
-        <w:t>append-only</w:t>
-      </w:r>
-      <w:proofErr w:type="spellEnd"/>
-      <w:r>
-        <w:t xml:space="preserve"> por diseño (predicciones, alertas, auditorías, retroalimentación, </w:t>
-      </w:r>
-      <w:proofErr w:type="spellStart"/>
-      <w:r>
-        <w:t>datasets</w:t>
-      </w:r>
-      <w:proofErr w:type="spellEnd"/>
-      <w:r>
-        <w:t>, métricas). Lanza excepción con mensaje descriptivo en todos los casos.</w:t>
-      </w:r>
-    </w:p>
-    <w:p>
-      <w:pPr>
-        <w:pStyle w:val="Ttulo2"/>
-      </w:pPr>
-      <w:bookmarkStart w:id="21" w:name="_Toc229056136"/>
-      <w:r>
-        <w:lastRenderedPageBreak/>
-        <w:t xml:space="preserve">Store </w:t>
-      </w:r>
-      <w:proofErr w:type="spellStart"/>
-      <w:r>
-        <w:t>Procedure</w:t>
-      </w:r>
-      <w:bookmarkEnd w:id="21"/>
-      <w:proofErr w:type="spellEnd"/>
-    </w:p>
-    <w:p>
-      <w:pPr>
-        <w:pStyle w:val="Ttulo3"/>
-      </w:pPr>
-      <w:bookmarkStart w:id="22" w:name="_Toc229056137"/>
-      <w:proofErr w:type="spellStart"/>
-      <w:r>
-        <w:t>sp_registrar_observacion_clinica</w:t>
-      </w:r>
-      <w:bookmarkEnd w:id="22"/>
-      <w:proofErr w:type="spellEnd"/>
-    </w:p>
-    <w:p>
-      <w:r>
-        <w:t>Persiste una nueva observación clínica en `</w:t>
-      </w:r>
-      <w:proofErr w:type="spellStart"/>
-      <w:r>
-        <w:t>observaciones_clinicas</w:t>
-      </w:r>
-      <w:proofErr w:type="spellEnd"/>
-      <w:r>
-        <w:t>` y sus signos asociados en `</w:t>
-      </w:r>
-      <w:proofErr w:type="spellStart"/>
-      <w:r>
-        <w:t>detalles_signos</w:t>
-      </w:r>
-      <w:proofErr w:type="spellEnd"/>
-      <w:r>
-        <w:t>`. Valida que el activo biológico exista y esté activo (M02) y que el usuario tenga sesión válida. Registra el evento de auditoría correspondiente en `</w:t>
-      </w:r>
-      <w:proofErr w:type="spellStart"/>
-      <w:r>
-        <w:t>auditorias_predicciones</w:t>
-      </w:r>
-      <w:proofErr w:type="spellEnd"/>
-      <w:r>
-        <w:t>` al finalizar.</w:t>
-      </w:r>
-    </w:p>
-    <w:p/>
-    <w:p>
-      <w:pPr>
-        <w:pStyle w:val="Ttulo3"/>
-      </w:pPr>
-      <w:bookmarkStart w:id="23" w:name="_Toc229056138"/>
-      <w:proofErr w:type="spellStart"/>
-      <w:r>
-        <w:t>sp_ejecutar_inferencia</w:t>
-      </w:r>
-      <w:bookmarkEnd w:id="23"/>
-      <w:proofErr w:type="spellEnd"/>
-    </w:p>
-    <w:p>
-      <w:r>
-        <w:t>Orquesta el flujo completo de inferencia (RF-66). Recibe el paquete de entrada (activo, especie, variables de la ventana temporal, versión del modelo). Llama a `</w:t>
-      </w:r>
-      <w:proofErr w:type="spellStart"/>
-      <w:r>
-        <w:t>fn_obtener_modelo_activo_por_especie</w:t>
-      </w:r>
-      <w:proofErr w:type="spellEnd"/>
-      <w:r>
-        <w:t xml:space="preserve">`, registra el resultado en `predicciones` con todos sus campos requeridos (probabilidad, </w:t>
-      </w:r>
-      <w:proofErr w:type="spellStart"/>
-      <w:r>
-        <w:t>clase_predicha</w:t>
-      </w:r>
-      <w:proofErr w:type="spellEnd"/>
-      <w:r>
-        <w:t xml:space="preserve">, confianza, </w:t>
-      </w:r>
-      <w:proofErr w:type="spellStart"/>
-      <w:r>
-        <w:t>features_json</w:t>
-      </w:r>
-      <w:proofErr w:type="spellEnd"/>
-      <w:r>
-        <w:t xml:space="preserve">, </w:t>
-      </w:r>
-      <w:proofErr w:type="spellStart"/>
-      <w:r>
-        <w:t>latencia_ms</w:t>
-      </w:r>
-      <w:proofErr w:type="spellEnd"/>
-      <w:r>
-        <w:t>), y llama a `</w:t>
-      </w:r>
-      <w:proofErr w:type="spellStart"/>
-      <w:r>
-        <w:t>sp_evaluar_umbral_y_generar_alerta</w:t>
-      </w:r>
-      <w:proofErr w:type="spellEnd"/>
-      <w:r>
-        <w:t>` si corresponde. Si el contexto es incompleto, marca `</w:t>
-      </w:r>
-      <w:proofErr w:type="spellStart"/>
-      <w:r>
-        <w:t>confianza_modelo</w:t>
-      </w:r>
-      <w:proofErr w:type="spellEnd"/>
-      <w:r>
-        <w:t>` reducida. Si la latencia supera 2 s, registra el evento LATENCIA_EXCEDIDA en auditoría.</w:t>
-      </w:r>
-    </w:p>
-    <w:p/>
-    <w:p>
-      <w:pPr>
-        <w:pStyle w:val="Ttulo3"/>
-      </w:pPr>
-      <w:bookmarkStart w:id="24" w:name="_Toc229056139"/>
-      <w:proofErr w:type="spellStart"/>
-      <w:r>
-        <w:t>sp_evaluar_umbral_y_generar_alerta</w:t>
-      </w:r>
-      <w:bookmarkEnd w:id="24"/>
-      <w:proofErr w:type="spellEnd"/>
-    </w:p>
-    <w:p>
-      <w:r>
-        <w:t>Recibe el `</w:t>
-      </w:r>
-      <w:proofErr w:type="spellStart"/>
-      <w:r>
-        <w:t>id_prediccion</w:t>
-      </w:r>
-      <w:proofErr w:type="spellEnd"/>
-      <w:r>
-        <w:t>` recién creada. Usa `</w:t>
-      </w:r>
-      <w:proofErr w:type="spellStart"/>
-      <w:r>
-        <w:t>fn_supera_umbral_clasificacion</w:t>
-      </w:r>
-      <w:proofErr w:type="spellEnd"/>
-      <w:r>
-        <w:t>` para determinar si se debe generar una alerta. Si sí, inserta en `</w:t>
-      </w:r>
-      <w:proofErr w:type="spellStart"/>
-      <w:r>
-        <w:t>alertas_patologicas</w:t>
-      </w:r>
-      <w:proofErr w:type="spellEnd"/>
-      <w:r>
-        <w:t>` con nivel de criticidad derivado de la probabilidad, estado PENDIENTE, y llama al sistema de notificaciones (RF-57). Registra el evento ALERTA_PREDICCION_GENERADA en auditoría.</w:t>
-      </w:r>
-    </w:p>
-    <w:p/>
-    <w:p>
-      <w:pPr>
-        <w:pStyle w:val="Ttulo3"/>
-      </w:pPr>
-      <w:bookmarkStart w:id="25" w:name="_Toc229056140"/>
-      <w:proofErr w:type="spellStart"/>
-      <w:r>
-        <w:t>sp_registrar_version_modelo</w:t>
-      </w:r>
-      <w:bookmarkEnd w:id="25"/>
-      <w:proofErr w:type="spellEnd"/>
-    </w:p>
-    <w:p>
-      <w:r>
-        <w:t>Inserta una nueva versión en `</w:t>
-      </w:r>
-      <w:proofErr w:type="spellStart"/>
-      <w:r>
-        <w:t>versiones_modelos</w:t>
-      </w:r>
-      <w:proofErr w:type="spellEnd"/>
-      <w:r>
-        <w:t>` con estado inicial EN_VALIDACION. Recibe los metadatos del modelo (nombre, algoritmo, métricas calculadas, hash del artefacto, ruta). Llama a `</w:t>
-      </w:r>
-      <w:proofErr w:type="spellStart"/>
-      <w:r>
-        <w:t>fn_validar_metricas_modelo</w:t>
-      </w:r>
-      <w:proofErr w:type="spellEnd"/>
-      <w:r>
-        <w:t>`; si las métricas no cumplen los mínimos, marca el estado como RECHAZADO y registra el evento VERSION_RECHAZADA. Si cumplen, registra VERSION_REGISTRADA. Asocia el `</w:t>
-      </w:r>
-      <w:proofErr w:type="spellStart"/>
-      <w:r>
-        <w:t>id_dataset</w:t>
-      </w:r>
-      <w:proofErr w:type="spellEnd"/>
-      <w:r>
-        <w:t>` correspondiente en `</w:t>
-      </w:r>
-      <w:proofErr w:type="spellStart"/>
-      <w:r>
-        <w:t>datasets</w:t>
-      </w:r>
-      <w:proofErr w:type="spellEnd"/>
-      <w:r>
-        <w:t>`.</w:t>
-      </w:r>
-    </w:p>
-    <w:p/>
-    <w:p>
-      <w:pPr>
-        <w:rPr>
-          <w:rStyle w:val="Ttulo3Car"/>
-        </w:rPr>
-      </w:pPr>
-      <w:bookmarkStart w:id="26" w:name="_Toc229056141"/>
-      <w:proofErr w:type="spellStart"/>
-      <w:r>
-        <w:rPr>
-          <w:rStyle w:val="Ttulo3Car"/>
-        </w:rPr>
-        <w:t>sp_aprobar_y_activar_version_modelo</w:t>
-      </w:r>
-      <w:bookmarkEnd w:id="26"/>
-      <w:proofErr w:type="spellEnd"/>
-    </w:p>
-    <w:p>
-      <w:r>
-        <w:t>Recibe el `</w:t>
-      </w:r>
-      <w:proofErr w:type="spellStart"/>
-      <w:r>
-        <w:t>id_version_modelo</w:t>
-      </w:r>
-      <w:proofErr w:type="spellEnd"/>
-      <w:r>
-        <w:t>` y el `</w:t>
-      </w:r>
-      <w:proofErr w:type="spellStart"/>
-      <w:r>
-        <w:t>id_usuario</w:t>
-      </w:r>
-      <w:proofErr w:type="spellEnd"/>
-      <w:r>
-        <w:t>` del veterinario que aprueba clínicamente. Valida que el modelo esté en estado EN_VALIDACION y que las métricas ya hayan sido evaluadas. Desactiva el modelo activo anterior (`</w:t>
-      </w:r>
-      <w:proofErr w:type="spellStart"/>
-      <w:r>
-        <w:t>esta_produccion</w:t>
-      </w:r>
-      <w:proofErr w:type="spellEnd"/>
-      <w:r>
-        <w:t xml:space="preserve"> = false`), activa el nuevo </w:t>
-      </w:r>
-      <w:r>
-        <w:lastRenderedPageBreak/>
-        <w:t>(`</w:t>
-      </w:r>
-      <w:proofErr w:type="spellStart"/>
-      <w:r>
-        <w:t>esta_produccion</w:t>
-      </w:r>
-      <w:proofErr w:type="spellEnd"/>
-      <w:r>
-        <w:t xml:space="preserve"> = true`) y registra el evento VERSION_ACTIVADA en auditoría. Es el único punto del sistema que puede pasar un modelo a producción.</w:t>
-      </w:r>
-    </w:p>
-    <w:p/>
-    <w:p>
-      <w:pPr>
-        <w:pStyle w:val="Ttulo3"/>
-      </w:pPr>
-      <w:bookmarkStart w:id="27" w:name="_Toc229056142"/>
-      <w:proofErr w:type="spellStart"/>
-      <w:r>
-        <w:t>sp_iniciar_ciclo_reentrenamiento</w:t>
-      </w:r>
-      <w:bookmarkEnd w:id="27"/>
-      <w:proofErr w:type="spellEnd"/>
-    </w:p>
-    <w:p>
-      <w:r>
-        <w:t xml:space="preserve">Orquesta el ciclo </w:t>
-      </w:r>
-      <w:proofErr w:type="spellStart"/>
-      <w:r>
-        <w:t>MLOps</w:t>
-      </w:r>
-      <w:proofErr w:type="spellEnd"/>
-      <w:r>
-        <w:t xml:space="preserve"> completo (RF-71). Recibe el `</w:t>
-      </w:r>
-      <w:proofErr w:type="spellStart"/>
-      <w:r>
-        <w:t>trigger_reentrenamiento</w:t>
-      </w:r>
-      <w:proofErr w:type="spellEnd"/>
-      <w:r>
-        <w:t>` (PROGRAMADO, MANUAL, DEGRADACION), `</w:t>
-      </w:r>
-      <w:proofErr w:type="spellStart"/>
-      <w:r>
-        <w:t>tipo_modelo</w:t>
-      </w:r>
-      <w:proofErr w:type="spellEnd"/>
-      <w:r>
-        <w:t>`, rango de fechas y parámetros. Inserta el registro en `</w:t>
-      </w:r>
-      <w:proofErr w:type="spellStart"/>
-      <w:r>
-        <w:t>ciclos_entrenamientos</w:t>
-      </w:r>
-      <w:proofErr w:type="spellEnd"/>
-      <w:r>
-        <w:t>` con estado PLANIFICADO → EN_EJECUCION. Llama a `</w:t>
-      </w:r>
-      <w:proofErr w:type="spellStart"/>
-      <w:r>
-        <w:t>fn_contar_registros_etiquetados_disponibles</w:t>
-      </w:r>
-      <w:proofErr w:type="spellEnd"/>
-      <w:r>
-        <w:t xml:space="preserve">`; si hay menos de 500 registros, aborta con causa DATASET_INSUFICIENTE. Llama a `fn_dataset_hash_sha256` para generar la huella del </w:t>
-      </w:r>
-      <w:proofErr w:type="spellStart"/>
-      <w:r>
-        <w:t>dataset</w:t>
-      </w:r>
-      <w:proofErr w:type="spellEnd"/>
-      <w:r>
-        <w:t>, construye el registro en `</w:t>
-      </w:r>
-      <w:proofErr w:type="spellStart"/>
-      <w:r>
-        <w:t>datasets</w:t>
-      </w:r>
-      <w:proofErr w:type="spellEnd"/>
-      <w:r>
-        <w:t>`, y al finalizar el entrenamiento entrega el artefacto a `</w:t>
-      </w:r>
-      <w:proofErr w:type="spellStart"/>
-      <w:r>
-        <w:t>sp_registrar_version_modelo</w:t>
-      </w:r>
-      <w:proofErr w:type="spellEnd"/>
-      <w:r>
-        <w:t>`. Registra eventos en auditoría en cada fase (INICIADO, COMPLETADO, FALLIDO, ABORTADO).</w:t>
-      </w:r>
-    </w:p>
-    <w:p/>
-    <w:p>
-      <w:pPr>
-        <w:pStyle w:val="Ttulo3"/>
-      </w:pPr>
-      <w:bookmarkStart w:id="28" w:name="_Toc229056143"/>
-      <w:proofErr w:type="spellStart"/>
-      <w:r>
-        <w:t>sp_evaluar_degradacion_modelo</w:t>
-      </w:r>
-      <w:bookmarkEnd w:id="28"/>
-      <w:proofErr w:type="spellEnd"/>
-    </w:p>
-    <w:p>
-      <w:r>
-        <w:t xml:space="preserve">Evaluación mensual (configurable) del modelo activo (RF-71, </w:t>
-      </w:r>
-      <w:proofErr w:type="spellStart"/>
-      <w:r>
-        <w:t>trigger</w:t>
-      </w:r>
-      <w:proofErr w:type="spellEnd"/>
-      <w:r>
-        <w:t xml:space="preserve"> DEGRADACION). Llama a `</w:t>
-      </w:r>
-      <w:proofErr w:type="spellStart"/>
-      <w:r>
-        <w:t>fn_calcular_drift_score</w:t>
-      </w:r>
-      <w:proofErr w:type="spellEnd"/>
-      <w:r>
-        <w:t xml:space="preserve">` sobre datos de los últimos 30 días con </w:t>
-      </w:r>
-      <w:proofErr w:type="spellStart"/>
-      <w:r>
-        <w:t>apto_para_ia</w:t>
-      </w:r>
-      <w:proofErr w:type="spellEnd"/>
-      <w:r>
-        <w:t xml:space="preserve"> = true. Si el F1-score global cae por debajo de 0.80 y hay al menos 100 registros con etiqueta verificada, activa `</w:t>
-      </w:r>
-      <w:proofErr w:type="spellStart"/>
-      <w:r>
-        <w:t>sp_iniciar_ciclo_reentrenamiento</w:t>
-      </w:r>
-      <w:proofErr w:type="spellEnd"/>
-      <w:r>
-        <w:t xml:space="preserve">` con </w:t>
-      </w:r>
-      <w:proofErr w:type="spellStart"/>
-      <w:r>
-        <w:t>trigger</w:t>
-      </w:r>
-      <w:proofErr w:type="spellEnd"/>
-      <w:r>
-        <w:t xml:space="preserve"> DEGRADACION. Si hay menos registros verificados, pospone y notifica al administrador. Registra DEGRADACION_DETECTADA en auditoría.</w:t>
-      </w:r>
-    </w:p>
-    <w:p/>
-    <w:p>
-      <w:proofErr w:type="spellStart"/>
-      <w:r>
-        <w:t>sp_registrar_retroalimentacion_clinica</w:t>
-      </w:r>
-      <w:proofErr w:type="spellEnd"/>
-    </w:p>
-    <w:p>
-      <w:r>
-        <w:t>Registra la retroalimentación del veterinario sobre una predicción (RF-72). Valida existencia de la predicción en `predicciones`, rol del usuario, que no exista retroalimentación previa del mismo usuario para esa predicción, que el estado sea del dominio permitido (CORRECTO, PARCIAL, INCORRECTO, SIN_EVENTO), que el diagnóstico real exista en RF-64 cuando es obligatorio, y que la fecha esté dentro de la ventana temporal (llama a `</w:t>
-      </w:r>
-      <w:proofErr w:type="spellStart"/>
-      <w:r>
-        <w:t>fn_verificar_ventana_retroalimentacion</w:t>
-      </w:r>
-      <w:proofErr w:type="spellEnd"/>
-      <w:r>
-        <w:t>`). Persiste el registro en `</w:t>
-      </w:r>
-      <w:proofErr w:type="spellStart"/>
-      <w:r>
-        <w:t>auditorias_predicciones</w:t>
-      </w:r>
-      <w:proofErr w:type="spellEnd"/>
-      <w:r>
-        <w:t>` con acción RETROALIMENTACION. Llama a `</w:t>
-      </w:r>
-      <w:proofErr w:type="spellStart"/>
-      <w:r>
-        <w:t>fn_detectar_conflicto_retroalimentacion</w:t>
-      </w:r>
-      <w:proofErr w:type="spellEnd"/>
-      <w:r>
-        <w:t>`; si hay conflicto, registra CONFLICTO_RETROALIMENTACION en auditoría.</w:t>
-      </w:r>
-    </w:p>
-    <w:p/>
-    <w:p>
-      <w:pPr>
-        <w:pStyle w:val="Ttulo3"/>
-      </w:pPr>
-      <w:bookmarkStart w:id="29" w:name="_Toc229056144"/>
-      <w:proofErr w:type="spellStart"/>
-      <w:r>
-        <w:t>sp_distribuir_modelo_ota</w:t>
-      </w:r>
-      <w:bookmarkEnd w:id="29"/>
-      <w:proofErr w:type="spellEnd"/>
-    </w:p>
-    <w:p>
-      <w:r>
-        <w:t>Orquesta la distribución OTA (RF-70). Recibe el `</w:t>
-      </w:r>
-      <w:proofErr w:type="spellStart"/>
-      <w:r>
-        <w:t>id_version_modelo</w:t>
-      </w:r>
-      <w:proofErr w:type="spellEnd"/>
-      <w:r>
-        <w:t xml:space="preserve">` y los dispositivos destino. Valida que el modelo tenga estado APROBADO. Registra el proceso de descarga </w:t>
-      </w:r>
-      <w:r>
-        <w:lastRenderedPageBreak/>
-        <w:t>fragmentada, verifica el hash SHA-256 en el dispositivo antes de activar el modelo, y en caso de falla mantiene la versión anterior activa (</w:t>
-      </w:r>
-      <w:proofErr w:type="spellStart"/>
-      <w:r>
-        <w:t>rollback</w:t>
-      </w:r>
-      <w:proofErr w:type="spellEnd"/>
-      <w:r>
-        <w:t>). Registra eventos MODELO_DISTRIBUIDO_EDGE o HASH_INVALIDO_DETECTADO según resultado.</w:t>
-      </w:r>
-    </w:p>
-    <w:p/>
-    <w:p>
-      <w:pPr>
-        <w:pStyle w:val="Ttulo3"/>
-      </w:pPr>
-      <w:bookmarkStart w:id="30" w:name="_Toc229056145"/>
-      <w:proofErr w:type="spellStart"/>
-      <w:r>
-        <w:t>sp_registrar_evento_auditoria</w:t>
-      </w:r>
-      <w:bookmarkEnd w:id="30"/>
-      <w:proofErr w:type="spellEnd"/>
-    </w:p>
-    <w:p>
-      <w:r>
-        <w:t>Procedimiento centralizado de auditoría (RF-73). Recibe todos los campos del esquema base (</w:t>
-      </w:r>
-      <w:proofErr w:type="spellStart"/>
-      <w:r>
-        <w:t>tipo_evento</w:t>
-      </w:r>
-      <w:proofErr w:type="spellEnd"/>
-      <w:r>
-        <w:t xml:space="preserve">, modulo='M04', </w:t>
-      </w:r>
-      <w:proofErr w:type="spellStart"/>
-      <w:r>
-        <w:t>tipo_actor</w:t>
-      </w:r>
-      <w:proofErr w:type="spellEnd"/>
-      <w:r>
-        <w:t xml:space="preserve">, </w:t>
-      </w:r>
-      <w:proofErr w:type="spellStart"/>
-      <w:r>
-        <w:t>id_usuario</w:t>
-      </w:r>
-      <w:proofErr w:type="spellEnd"/>
-      <w:r>
-        <w:t xml:space="preserve"> o </w:t>
-      </w:r>
-      <w:proofErr w:type="spellStart"/>
-      <w:r>
-        <w:t>id_sistema</w:t>
-      </w:r>
-      <w:proofErr w:type="spellEnd"/>
-      <w:r>
-        <w:t xml:space="preserve">, </w:t>
-      </w:r>
-      <w:proofErr w:type="spellStart"/>
-      <w:r>
-        <w:t>id_referencia</w:t>
-      </w:r>
-      <w:proofErr w:type="spellEnd"/>
-      <w:r>
-        <w:t xml:space="preserve">, </w:t>
-      </w:r>
-      <w:proofErr w:type="spellStart"/>
-      <w:r>
-        <w:t>entidad_referencia</w:t>
-      </w:r>
-      <w:proofErr w:type="spellEnd"/>
-      <w:r>
-        <w:t xml:space="preserve">, </w:t>
-      </w:r>
-      <w:proofErr w:type="spellStart"/>
-      <w:r>
-        <w:t>correlacion_id</w:t>
-      </w:r>
-      <w:proofErr w:type="spellEnd"/>
-      <w:r>
-        <w:t xml:space="preserve">, </w:t>
-      </w:r>
-      <w:proofErr w:type="spellStart"/>
-      <w:r>
-        <w:t>payload_evento</w:t>
-      </w:r>
-      <w:proofErr w:type="spellEnd"/>
-      <w:r>
-        <w:t xml:space="preserve">, </w:t>
-      </w:r>
-      <w:proofErr w:type="spellStart"/>
-      <w:r>
-        <w:t>severidad_evento</w:t>
-      </w:r>
-      <w:proofErr w:type="spellEnd"/>
-      <w:r>
-        <w:t xml:space="preserve">, </w:t>
-      </w:r>
-      <w:proofErr w:type="spellStart"/>
-      <w:r>
-        <w:t>resultado_operacion</w:t>
-      </w:r>
-      <w:proofErr w:type="spellEnd"/>
-      <w:r>
-        <w:t xml:space="preserve">, </w:t>
-      </w:r>
-      <w:proofErr w:type="spellStart"/>
-      <w:r>
-        <w:t>latencia_ms</w:t>
-      </w:r>
-      <w:proofErr w:type="spellEnd"/>
-      <w:r>
-        <w:t xml:space="preserve">, </w:t>
-      </w:r>
-      <w:proofErr w:type="spellStart"/>
-      <w:r>
-        <w:t>version_modelo</w:t>
-      </w:r>
-      <w:proofErr w:type="spellEnd"/>
-      <w:r>
-        <w:t xml:space="preserve">, </w:t>
-      </w:r>
-      <w:proofErr w:type="spellStart"/>
-      <w:r>
-        <w:t>origen_dato</w:t>
-      </w:r>
-      <w:proofErr w:type="spellEnd"/>
-      <w:r>
-        <w:t xml:space="preserve">). Valida que no sean nulos simultáneamente </w:t>
-      </w:r>
-      <w:proofErr w:type="spellStart"/>
-      <w:r>
-        <w:t>id_usuario</w:t>
-      </w:r>
-      <w:proofErr w:type="spellEnd"/>
-      <w:r>
-        <w:t xml:space="preserve"> e </w:t>
-      </w:r>
-      <w:proofErr w:type="spellStart"/>
-      <w:r>
-        <w:t>id_sistema</w:t>
-      </w:r>
-      <w:proofErr w:type="spellEnd"/>
-      <w:r>
-        <w:t xml:space="preserve">. Valida que el </w:t>
-      </w:r>
-      <w:proofErr w:type="spellStart"/>
-      <w:r>
-        <w:t>payload</w:t>
-      </w:r>
-      <w:proofErr w:type="spellEnd"/>
-      <w:r>
-        <w:t xml:space="preserve"> no exceda 64 KB (trunca y agrega `</w:t>
-      </w:r>
-      <w:proofErr w:type="spellStart"/>
-      <w:r>
-        <w:t>payload_truncado</w:t>
-      </w:r>
-      <w:proofErr w:type="spellEnd"/>
-      <w:r>
-        <w:t xml:space="preserve">: true` si excede). Inserta en el repositorio de auditoría en modo </w:t>
-      </w:r>
-      <w:proofErr w:type="spellStart"/>
-      <w:r>
-        <w:t>append-only</w:t>
-      </w:r>
-      <w:proofErr w:type="spellEnd"/>
-      <w:r>
-        <w:t xml:space="preserve">. Si falla la persistencia, activa el mecanismo de </w:t>
-      </w:r>
-      <w:proofErr w:type="spellStart"/>
-      <w:r>
-        <w:t>fallback</w:t>
-      </w:r>
-      <w:proofErr w:type="spellEnd"/>
-      <w:r>
-        <w:t xml:space="preserve"> a log local. Este procedimiento es llamado por todos los demás procedimientos del módulo.</w:t>
-      </w:r>
-    </w:p>
-    <w:p/>
-    <w:p>
-      <w:pPr>
-        <w:pStyle w:val="Ttulo3"/>
-      </w:pPr>
-      <w:bookmarkStart w:id="31" w:name="_Toc229056146"/>
-      <w:proofErr w:type="spellStart"/>
-      <w:r>
-        <w:t>sp_actualizar_estado_alerta</w:t>
-      </w:r>
-      <w:bookmarkEnd w:id="31"/>
-      <w:proofErr w:type="spellEnd"/>
-    </w:p>
-    <w:p>
-      <w:r>
-        <w:t>Actualiza el estado de una alerta patológica en `</w:t>
-      </w:r>
-      <w:proofErr w:type="spellStart"/>
-      <w:r>
-        <w:t>alertas_patologicas</w:t>
-      </w:r>
-      <w:proofErr w:type="spellEnd"/>
-      <w:r>
-        <w:t>` (de PENDIENTE a EN_REVISION, CONFIRMADA o DESESTIMADA). Registra el `</w:t>
-      </w:r>
-      <w:proofErr w:type="spellStart"/>
-      <w:r>
-        <w:t>diagnostico_confirmado</w:t>
-      </w:r>
-      <w:proofErr w:type="spellEnd"/>
-      <w:r>
-        <w:t>`, el valor de `</w:t>
-      </w:r>
-      <w:proofErr w:type="spellStart"/>
-      <w:r>
-        <w:t>es_verdadero</w:t>
-      </w:r>
-      <w:proofErr w:type="spellEnd"/>
-      <w:r>
-        <w:t>` según la evaluación clínica, y la fecha de notificación. Registra el evento de auditoría correspondiente.</w:t>
-      </w:r>
+      <w:bookmarkEnd w:id="1"/>
     </w:p>
     <w:p>
       <w:pPr>

</xml_diff>